<commit_message>
fix: production api binding and mobile fixed layout
</commit_message>
<xml_diff>
--- a/adultMasterProject_masterplan_20260409_v31.docx
+++ b/adultMasterProject_masterplan_20260409_v31.docx
@@ -29122,6 +29122,477 @@
       </w:pPr>
       <w:r>
         <w:t>부족 항목은 실 PG 계약키·서명검증, 실 세무 발급사 연동·실패 재처리, 실기기 캡처/App Preview, 운영 PostgreSQL+Alebic 운용, CI 자동 테스트 고정이다.</w:t>
+      </w:r>
+    </w:p>
+    <w:p/>
+    <w:p>
+      <w:r>
+        <w:rPr>
+          <w:b/>
+        </w:rPr>
+        <w:t>43. 상단바 중앙 화면명 표시 유지 업데이트 (2026-04-08)</w:t>
+      </w:r>
+    </w:p>
+    <w:p>
+      <w:pPr>
+        <w:pStyle w:val="ListBullet"/>
+      </w:pPr>
+      <w:r>
+        <w:t>이번 반영 요약: 상단바의 고정 브랜드 문구는 사용하지 않고, 중앙에는 현재 활성 화면명을 표시하는 구조를 유지한다.</w:t>
+      </w:r>
+    </w:p>
+    <w:p>
+      <w:pPr>
+        <w:pStyle w:val="ListBullet"/>
+      </w:pPr>
+      <w:r>
+        <w:t>적용 기준: 홈·쇼핑·채팅·소통·장바구니·프로필 탭 전환 시 상단 중앙 제목이 즉시 동일하게 바뀌어야 한다.</w:t>
+      </w:r>
+    </w:p>
+    <w:p>
+      <w:pPr>
+        <w:pStyle w:val="ListBullet"/>
+      </w:pPr>
+      <w:r>
+        <w:t>최신 진행도 유지: 전체 91% / 앱 프로젝트 97% / 인프라·배포 87% / QA·테스트 80%.</w:t>
+      </w:r>
+    </w:p>
+    <w:p>
+      <w:pPr>
+        <w:pStyle w:val="ListBullet"/>
+      </w:pPr>
+      <w:r>
+        <w:t>최신 부족항목 유지: 실 PG 계약키·서명검증, 실 세무발급사 연동·실패 재처리, 실기기 캡처·App Preview, 운영 PostgreSQL+Alebic 운용, CI 자동 테스트 고정.</w:t>
+      </w:r>
+    </w:p>
+    <w:p>
+      <w:r>
+        <w:br w:type="page"/>
+      </w:r>
+    </w:p>
+    <w:p>
+      <w:pPr>
+        <w:pStyle w:val="Heading1"/>
+      </w:pPr>
+      <w:r>
+        <w:t>추가 업데이트 보고 · 2026-04-09</w:t>
+      </w:r>
+    </w:p>
+    <w:p>
+      <w:r>
+        <w:rPr>
+          <w:b/>
+        </w:rPr>
+        <w:t xml:space="preserve">전체 진행도: </w:t>
+      </w:r>
+      <w:r>
+        <w:t>93%</w:t>
+      </w:r>
+      <w:r>
+        <w:t xml:space="preserve"> · Production API 기본 바인딩, 모바일 상단/하단 고정, 홈/쇼핑 상단 서브탭 구조 반영 완료.</w:t>
+      </w:r>
+    </w:p>
+    <w:p>
+      <w:r>
+        <w:rPr>
+          <w:b/>
+        </w:rPr>
+        <w:t>세부 진행도</w:t>
+      </w:r>
+    </w:p>
+    <w:tbl>
+      <w:tblPr>
+        <w:tblStyle w:val="TableGrid"/>
+        <w:tblW w:type="auto" w:w="0"/>
+        <w:tblLook w:firstColumn="1" w:firstRow="1" w:lastColumn="0" w:lastRow="0" w:noHBand="0" w:noVBand="1" w:val="04A0"/>
+      </w:tblPr>
+      <w:tblGrid>
+        <w:gridCol w:w="2521"/>
+        <w:gridCol w:w="2521"/>
+        <w:gridCol w:w="2521"/>
+        <w:gridCol w:w="2521"/>
+      </w:tblGrid>
+      <w:tr>
+        <w:tc>
+          <w:tcPr>
+            <w:tcW w:type="dxa" w:w="2521"/>
+          </w:tcPr>
+          <w:p>
+            <w:r>
+              <w:t>구분</w:t>
+            </w:r>
+          </w:p>
+        </w:tc>
+        <w:tc>
+          <w:tcPr>
+            <w:tcW w:type="dxa" w:w="2521"/>
+          </w:tcPr>
+          <w:p>
+            <w:r>
+              <w:t>완성도</w:t>
+            </w:r>
+          </w:p>
+        </w:tc>
+        <w:tc>
+          <w:tcPr>
+            <w:tcW w:type="dxa" w:w="2521"/>
+          </w:tcPr>
+          <w:p>
+            <w:r>
+              <w:t>현재 상태</w:t>
+            </w:r>
+          </w:p>
+        </w:tc>
+        <w:tc>
+          <w:tcPr>
+            <w:tcW w:type="dxa" w:w="2521"/>
+          </w:tcPr>
+          <w:p>
+            <w:r>
+              <w:t>부족한 부분</w:t>
+            </w:r>
+          </w:p>
+        </w:tc>
+      </w:tr>
+      <w:tr>
+        <w:tc>
+          <w:tcPr>
+            <w:tcW w:type="dxa" w:w="2521"/>
+          </w:tcPr>
+          <w:p>
+            <w:r>
+              <w:t>기획/계획</w:t>
+            </w:r>
+          </w:p>
+        </w:tc>
+        <w:tc>
+          <w:tcPr>
+            <w:tcW w:type="dxa" w:w="2521"/>
+          </w:tcPr>
+          <w:p>
+            <w:r>
+              <w:t>96%</w:t>
+            </w:r>
+          </w:p>
+        </w:tc>
+        <w:tc>
+          <w:tcPr>
+            <w:tcW w:type="dxa" w:w="2521"/>
+          </w:tcPr>
+          <w:p>
+            <w:r>
+              <w:t>문서 기준 강함</w:t>
+            </w:r>
+          </w:p>
+        </w:tc>
+        <w:tc>
+          <w:tcPr>
+            <w:tcW w:type="dxa" w:w="2521"/>
+          </w:tcPr>
+          <w:p>
+            <w:r>
+              <w:t>최종 의사결정 확정본 서명 / 외부 회신 반영</w:t>
+            </w:r>
+          </w:p>
+        </w:tc>
+      </w:tr>
+      <w:tr>
+        <w:tc>
+          <w:tcPr>
+            <w:tcW w:type="dxa" w:w="2521"/>
+          </w:tcPr>
+          <w:p>
+            <w:r>
+              <w:t>앱 프로젝트</w:t>
+            </w:r>
+          </w:p>
+        </w:tc>
+        <w:tc>
+          <w:tcPr>
+            <w:tcW w:type="dxa" w:w="2521"/>
+          </w:tcPr>
+          <w:p>
+            <w:r>
+              <w:t>98%</w:t>
+            </w:r>
+          </w:p>
+        </w:tc>
+        <w:tc>
+          <w:tcPr>
+            <w:tcW w:type="dxa" w:w="2521"/>
+          </w:tcPr>
+          <w:p>
+            <w:r>
+              <w:t>Production API fallback 및 고정 레이아웃 반영</w:t>
+            </w:r>
+          </w:p>
+        </w:tc>
+        <w:tc>
+          <w:tcPr>
+            <w:tcW w:type="dxa" w:w="2521"/>
+          </w:tcPr>
+          <w:p>
+            <w:r>
+              <w:t>실주문·실결제 연동 / 실기기 테스트</w:t>
+            </w:r>
+          </w:p>
+        </w:tc>
+      </w:tr>
+      <w:tr>
+        <w:tc>
+          <w:tcPr>
+            <w:tcW w:type="dxa" w:w="2521"/>
+          </w:tcPr>
+          <w:p>
+            <w:r>
+              <w:t>앱 등록</w:t>
+            </w:r>
+          </w:p>
+        </w:tc>
+        <w:tc>
+          <w:tcPr>
+            <w:tcW w:type="dxa" w:w="2521"/>
+          </w:tcPr>
+          <w:p>
+            <w:r>
+              <w:t>44%</w:t>
+            </w:r>
+          </w:p>
+        </w:tc>
+        <w:tc>
+          <w:tcPr>
+            <w:tcW w:type="dxa" w:w="2521"/>
+          </w:tcPr>
+          <w:p>
+            <w:r>
+              <w:t>safe UI 구조 준비</w:t>
+            </w:r>
+          </w:p>
+        </w:tc>
+        <w:tc>
+          <w:tcPr>
+            <w:tcW w:type="dxa" w:w="2521"/>
+          </w:tcPr>
+          <w:p>
+            <w:r>
+              <w:t>실기기 캡처 / App Preview / 메타데이터</w:t>
+            </w:r>
+          </w:p>
+        </w:tc>
+      </w:tr>
+      <w:tr>
+        <w:tc>
+          <w:tcPr>
+            <w:tcW w:type="dxa" w:w="2521"/>
+          </w:tcPr>
+          <w:p>
+            <w:r>
+              <w:t>PG 연동</w:t>
+            </w:r>
+          </w:p>
+        </w:tc>
+        <w:tc>
+          <w:tcPr>
+            <w:tcW w:type="dxa" w:w="2521"/>
+          </w:tcPr>
+          <w:p>
+            <w:r>
+              <w:t>40%</w:t>
+            </w:r>
+          </w:p>
+        </w:tc>
+        <w:tc>
+          <w:tcPr>
+            <w:tcW w:type="dxa" w:w="2521"/>
+          </w:tcPr>
+          <w:p>
+            <w:r>
+              <w:t>구조 준비</w:t>
+            </w:r>
+          </w:p>
+        </w:tc>
+        <w:tc>
+          <w:tcPr>
+            <w:tcW w:type="dxa" w:w="2521"/>
+          </w:tcPr>
+          <w:p>
+            <w:r>
+              <w:t>실 merchant key / 서명검증 / 승인 테스트</w:t>
+            </w:r>
+          </w:p>
+        </w:tc>
+      </w:tr>
+      <w:tr>
+        <w:tc>
+          <w:tcPr>
+            <w:tcW w:type="dxa" w:w="2521"/>
+          </w:tcPr>
+          <w:p>
+            <w:r>
+              <w:t>법/정책</w:t>
+            </w:r>
+          </w:p>
+        </w:tc>
+        <w:tc>
+          <w:tcPr>
+            <w:tcW w:type="dxa" w:w="2521"/>
+          </w:tcPr>
+          <w:p>
+            <w:r>
+              <w:t>91%</w:t>
+            </w:r>
+          </w:p>
+        </w:tc>
+        <w:tc>
+          <w:tcPr>
+            <w:tcW w:type="dxa" w:w="2521"/>
+          </w:tcPr>
+          <w:p>
+            <w:r>
+              <w:t>정책 문서 유지</w:t>
+            </w:r>
+          </w:p>
+        </w:tc>
+        <w:tc>
+          <w:tcPr>
+            <w:tcW w:type="dxa" w:w="2521"/>
+          </w:tcPr>
+          <w:p>
+            <w:r>
+              <w:t>법무 최종 확정본</w:t>
+            </w:r>
+          </w:p>
+        </w:tc>
+      </w:tr>
+      <w:tr>
+        <w:tc>
+          <w:tcPr>
+            <w:tcW w:type="dxa" w:w="2521"/>
+          </w:tcPr>
+          <w:p>
+            <w:r>
+              <w:t>SKU 조건</w:t>
+            </w:r>
+          </w:p>
+        </w:tc>
+        <w:tc>
+          <w:tcPr>
+            <w:tcW w:type="dxa" w:w="2521"/>
+          </w:tcPr>
+          <w:p>
+            <w:r>
+              <w:t>92%</w:t>
+            </w:r>
+          </w:p>
+        </w:tc>
+        <w:tc>
+          <w:tcPr>
+            <w:tcW w:type="dxa" w:w="2521"/>
+          </w:tcPr>
+          <w:p>
+            <w:r>
+              <w:t>운영 기준 유지</w:t>
+            </w:r>
+          </w:p>
+        </w:tc>
+        <w:tc>
+          <w:tcPr>
+            <w:tcW w:type="dxa" w:w="2521"/>
+          </w:tcPr>
+          <w:p>
+            <w:r>
+              <w:t>실 승인·불승인 SKU 매핑표 확정</w:t>
+            </w:r>
+          </w:p>
+        </w:tc>
+      </w:tr>
+    </w:tbl>
+    <w:p>
+      <w:pPr>
+        <w:pStyle w:val="ListBullet"/>
+      </w:pPr>
+      <w:r>
+        <w:t>이번 반영 1: Cloudflare Pages production build가 localhost:8000을 참조하지 않도록 API base resolver와 .env.production을 정리했습니다.</w:t>
+      </w:r>
+    </w:p>
+    <w:p>
+      <w:pPr>
+        <w:pStyle w:val="ListBullet"/>
+      </w:pPr>
+      <w:r>
+        <w:t>이번 반영 2: 모바일에서 상단 바/하단 바를 고정하고 본문만 스크롤되도록 화면 구조를 재편했습니다.</w:t>
+      </w:r>
+    </w:p>
+    <w:p>
+      <w:pPr>
+        <w:pStyle w:val="ListBullet"/>
+      </w:pPr>
+      <w:r>
+        <w:t>이번 반영 3: 상단 중앙 제목이 현재 화면과 서브화면명을 표시하고, 홈/쇼핑 좌측 서브탭을 추가했습니다.</w:t>
+      </w:r>
+    </w:p>
+    <w:p>
+      <w:pPr>
+        <w:pStyle w:val="ListBullet"/>
+      </w:pPr>
+      <w:r>
+        <w:t>이번 반영 4: 하단 탭을 홈 | 쇼핑 | 소통 | 채팅 | 프로필 5버튼 구조로 정리했습니다.</w:t>
+      </w:r>
+    </w:p>
+    <w:p>
+      <w:r>
+        <w:rPr>
+          <w:b/>
+        </w:rPr>
+        <w:t>현재 부족한 부분</w:t>
+      </w:r>
+    </w:p>
+    <w:p>
+      <w:pPr>
+        <w:pStyle w:val="ListBullet"/>
+      </w:pPr>
+      <w:r>
+        <w:t>실 PG 계약키/서명검증 규격 연결</w:t>
+      </w:r>
+    </w:p>
+    <w:p>
+      <w:pPr>
+        <w:pStyle w:val="ListBullet"/>
+      </w:pPr>
+      <w:r>
+        <w:t>실 PASS/NICE callback 및 응답코드 맵 반영</w:t>
+      </w:r>
+    </w:p>
+    <w:p>
+      <w:pPr>
+        <w:pStyle w:val="ListBullet"/>
+      </w:pPr>
+      <w:r>
+        <w:t>실 세무발급사 연결 및 실패 재처리</w:t>
+      </w:r>
+    </w:p>
+    <w:p>
+      <w:pPr>
+        <w:pStyle w:val="ListBullet"/>
+      </w:pPr>
+      <w:r>
+        <w:t>앱 제출용 실기기 캡처 / App Preview / 심사계정 정리</w:t>
+      </w:r>
+    </w:p>
+    <w:p>
+      <w:pPr>
+        <w:pStyle w:val="ListBullet"/>
+      </w:pPr>
+      <w:r>
+        <w:t>운영 PostgreSQL + Alembic 실제 리비전 운용</w:t>
+      </w:r>
+    </w:p>
+    <w:p>
+      <w:pPr>
+        <w:pStyle w:val="ListBullet"/>
+      </w:pPr>
+      <w:r>
+        <w:t>CI 수준 백엔드/프론트 자동 테스트 고정</w:t>
       </w:r>
     </w:p>
     <w:sectPr>

</xml_diff>